<commit_message>
add my_name_is and what_happened compound phrase gloss mappings
</commit_message>
<xml_diff>
--- a/FINAL_PROJECT_REPORT.docx
+++ b/FINAL_PROJECT_REPORT.docx
@@ -691,6 +691,48 @@
         <w:spacing w:after="80"/>
       </w:pPr>
       <w:r>
+        <w:t xml:space="preserve">Preprocess common phrases (like </w:t>
+      </w:r>
+      <w:r>
+        <w:rPr>
+          <w:rFonts w:ascii="Consolas" w:hAnsi="Consolas"/>
+          <w:color w:val="C7254E"/>
+          <w:sz w:val="19"/>
+        </w:rPr>
+        <w:t>"my name is"</w:t>
+      </w:r>
+      <w:r>
+        <w:t xml:space="preserve">, </w:t>
+      </w:r>
+      <w:r>
+        <w:rPr>
+          <w:rFonts w:ascii="Consolas" w:hAnsi="Consolas"/>
+          <w:color w:val="C7254E"/>
+          <w:sz w:val="19"/>
+        </w:rPr>
+        <w:t>"what is your name"</w:t>
+      </w:r>
+      <w:r>
+        <w:t xml:space="preserve">, </w:t>
+      </w:r>
+      <w:r>
+        <w:rPr>
+          <w:rFonts w:ascii="Consolas" w:hAnsi="Consolas"/>
+          <w:color w:val="C7254E"/>
+          <w:sz w:val="19"/>
+        </w:rPr>
+        <w:t>"what happened"</w:t>
+      </w:r>
+      <w:r>
+        <w:t>) into unified tokens before tokenizing to bypass stop words.</w:t>
+      </w:r>
+    </w:p>
+    <w:p>
+      <w:pPr>
+        <w:pStyle w:val="ListBullet"/>
+        <w:spacing w:after="80"/>
+      </w:pPr>
+      <w:r>
         <w:t xml:space="preserve">Omit grammatical stop words (e.g., </w:t>
       </w:r>
       <w:r>
@@ -710,7 +752,7 @@
           <w:color w:val="C7254E"/>
           <w:sz w:val="19"/>
         </w:rPr>
-        <w:t>"to"</w:t>
+        <w:t>"the"</w:t>
       </w:r>
       <w:r>
         <w:t xml:space="preserve">, </w:t>
@@ -721,7 +763,7 @@
           <w:color w:val="C7254E"/>
           <w:sz w:val="19"/>
         </w:rPr>
-        <w:t>"the"</w:t>
+        <w:t>"to"</w:t>
       </w:r>
       <w:r>
         <w:t>).</w:t>
@@ -1541,6 +1583,65 @@
       </w:r>
       <w:r>
         <w:t>:</w:t>
+      </w:r>
+    </w:p>
+    <w:p>
+      <w:pPr>
+        <w:pStyle w:val="ListBullet"/>
+        <w:spacing w:after="80"/>
+      </w:pPr>
+      <w:r>
+        <w:rPr>
+          <w:i/>
+        </w:rPr>
+        <w:t>Phrase Preprocessing</w:t>
+      </w:r>
+      <w:r>
+        <w:t xml:space="preserve">: Maps common phrases (like </w:t>
+      </w:r>
+      <w:r>
+        <w:rPr>
+          <w:rFonts w:ascii="Consolas" w:hAnsi="Consolas"/>
+          <w:color w:val="C7254E"/>
+          <w:sz w:val="19"/>
+        </w:rPr>
+        <w:t>"my name is"</w:t>
+      </w:r>
+      <w:r>
+        <w:t xml:space="preserve">, </w:t>
+      </w:r>
+      <w:r>
+        <w:rPr>
+          <w:rFonts w:ascii="Consolas" w:hAnsi="Consolas"/>
+          <w:color w:val="C7254E"/>
+          <w:sz w:val="19"/>
+        </w:rPr>
+        <w:t>"what is your name"</w:t>
+      </w:r>
+      <w:r>
+        <w:t xml:space="preserve">, </w:t>
+      </w:r>
+      <w:r>
+        <w:rPr>
+          <w:rFonts w:ascii="Consolas" w:hAnsi="Consolas"/>
+          <w:color w:val="C7254E"/>
+          <w:sz w:val="19"/>
+        </w:rPr>
+        <w:t>"what happened"</w:t>
+      </w:r>
+      <w:r>
+        <w:t xml:space="preserve">, </w:t>
+      </w:r>
+      <w:r>
+        <w:rPr>
+          <w:rFonts w:ascii="Consolas" w:hAnsi="Consolas"/>
+          <w:color w:val="C7254E"/>
+          <w:sz w:val="19"/>
+        </w:rPr>
+        <w:t>"yesterday"</w:t>
+      </w:r>
+      <w:r>
+        <w:t>) to compound tokens before parsing.</w:t>
       </w:r>
     </w:p>
     <w:p>

</xml_diff>